<commit_message>
docs: align cover with institutional format
</commit_message>
<xml_diff>
--- a/docs/Proyecto_Integrador_DevOps_Fase_1.docx
+++ b/docs/Proyecto_Integrador_DevOps_Fase_1.docx
@@ -4,7 +4,7 @@
   <w:body>
     <w:p>
       <w:pPr>
-        <w:spacing w:before="0" w:after="440" w:line="259" w:lineRule="auto"/>
+        <w:spacing w:before="0" w:after="120" w:line="259" w:lineRule="auto"/>
         <w:jc w:val="both"/>
       </w:pPr>
       <w:r>
@@ -24,7 +24,7 @@
       <w:r>
         <w:drawing>
           <wp:inline xmlns:a="http://schemas.openxmlformats.org/drawingml/2006/main" xmlns:pic="http://schemas.openxmlformats.org/drawingml/2006/picture">
-            <wp:extent cx="2834640" cy="1337369"/>
+            <wp:extent cx="3429000" cy="1617785"/>
             <wp:docPr id="1" name="Picture 1" descr="Logotipo institucional de la ESPAM MFL" title="ESPAM MFL"/>
             <wp:cNvGraphicFramePr>
               <a:graphicFrameLocks noChangeAspect="1"/>
@@ -37,7 +37,7 @@
                     <pic:cNvPicPr/>
                   </pic:nvPicPr>
                   <pic:blipFill>
-                    <a:blip r:embed="rId11"/>
+                    <a:blip r:embed="rId12"/>
                     <a:stretch>
                       <a:fillRect/>
                     </a:stretch>
@@ -45,7 +45,7 @@
                   <pic:spPr>
                     <a:xfrm>
                       <a:off x="0" y="0"/>
-                      <a:ext cx="2834640" cy="1337369"/>
+                      <a:ext cx="3429000" cy="1617785"/>
                     </a:xfrm>
                     <a:prstGeom prst="rect"/>
                   </pic:spPr>
@@ -58,7 +58,7 @@
     </w:p>
     <w:p>
       <w:pPr>
-        <w:spacing w:before="0" w:after="400" w:line="259" w:lineRule="auto"/>
+        <w:spacing w:before="0" w:after="140" w:line="259" w:lineRule="auto"/>
         <w:jc w:val="both"/>
       </w:pPr>
       <w:r>
@@ -73,23 +73,7 @@
     </w:p>
     <w:p>
       <w:pPr>
-        <w:spacing w:before="0" w:after="480" w:line="259" w:lineRule="auto"/>
-        <w:jc w:val="center"/>
-      </w:pPr>
-      <w:r>
-        <w:rPr>
-          <w:rFonts w:ascii="Calibri" w:hAnsi="Calibri"/>
-          <w:b/>
-          <w:i w:val="0"/>
-          <w:color w:val="667785"/>
-          <w:sz w:val="24"/>
-        </w:rPr>
-        <w:t>MAESTRÍA EN DISEÑO WEB Y DESARROLLO DE APPS</w:t>
-      </w:r>
-    </w:p>
-    <w:p>
-      <w:pPr>
-        <w:spacing w:before="0" w:after="100" w:line="259" w:lineRule="auto"/>
+        <w:spacing w:before="0" w:after="200" w:line="240" w:lineRule="auto"/>
         <w:jc w:val="center"/>
       </w:pPr>
       <w:r>
@@ -98,344 +82,16 @@
           <w:b/>
           <w:i w:val="0"/>
           <w:color w:val="12304A"/>
-          <w:sz w:val="44"/>
+          <w:sz w:val="22"/>
         </w:rPr>
-        <w:t>PROYECTO INTEGRADOR DEVOPS</w:t>
+        <w:t>ESCUELA SUPERIOR POLITÉCNICA AGROPECUARIA DE MANABÍ</w:t>
+        <w:br/>
+        <w:t>MANUEL FÉLIX LÓPEZ</w:t>
       </w:r>
     </w:p>
     <w:p>
       <w:pPr>
-        <w:spacing w:before="0" w:after="640" w:line="259" w:lineRule="auto"/>
-        <w:jc w:val="center"/>
-      </w:pPr>
-      <w:r>
-        <w:rPr>
-          <w:rFonts w:ascii="Calibri" w:hAnsi="Calibri"/>
-          <w:b w:val="0"/>
-          <w:i w:val="0"/>
-          <w:color w:val="006B58"/>
-          <w:sz w:val="26"/>
-        </w:rPr>
-        <w:t>Fase 1: diagnóstico y planificación</w:t>
-      </w:r>
-    </w:p>
-    <w:tbl>
-      <w:tblPr>
-        <w:tblStyle w:val="TableGrid"/>
-        <w:tblW w:type="dxa" w:w="9360"/>
-        <w:jc w:val="center"/>
-        <w:tblLayout w:type="fixed"/>
-        <w:tblLook w:firstColumn="1" w:firstRow="1" w:lastColumn="0" w:lastRow="0" w:noHBand="0" w:noVBand="1" w:val="04A0"/>
-        <w:tblInd w:w="120" w:type="dxa"/>
-      </w:tblPr>
-      <w:tblGrid>
-        <w:gridCol w:w="2600"/>
-        <w:gridCol w:w="6760"/>
-      </w:tblGrid>
-      <w:tr>
-        <w:trPr>
-          <w:tblHeader w:val="true"/>
-        </w:trPr>
-        <w:tc>
-          <w:tcPr>
-            <w:tcW w:type="dxa" w:w="2600"/>
-            <w:tcMar>
-              <w:top w:w="80" w:type="dxa"/>
-              <w:start w:w="120" w:type="dxa"/>
-              <w:bottom w:w="80" w:type="dxa"/>
-              <w:end w:w="120" w:type="dxa"/>
-            </w:tcMar>
-            <w:shd w:fill="12304A"/>
-            <w:vAlign w:val="center"/>
-          </w:tcPr>
-          <w:p>
-            <w:pPr>
-              <w:spacing w:after="0"/>
-              <w:jc w:val="left"/>
-            </w:pPr>
-            <w:r>
-              <w:rPr>
-                <w:rFonts w:ascii="Calibri" w:hAnsi="Calibri"/>
-                <w:b/>
-                <w:i w:val="0"/>
-                <w:color w:val="FFFFFF"/>
-                <w:sz w:val="18"/>
-              </w:rPr>
-              <w:t>Datos académicos</w:t>
-            </w:r>
-          </w:p>
-        </w:tc>
-        <w:tc>
-          <w:tcPr>
-            <w:tcW w:type="dxa" w:w="6760"/>
-            <w:tcMar>
-              <w:top w:w="80" w:type="dxa"/>
-              <w:start w:w="120" w:type="dxa"/>
-              <w:bottom w:w="80" w:type="dxa"/>
-              <w:end w:w="120" w:type="dxa"/>
-            </w:tcMar>
-            <w:shd w:fill="12304A"/>
-            <w:vAlign w:val="center"/>
-          </w:tcPr>
-          <w:p>
-            <w:pPr>
-              <w:spacing w:after="0"/>
-              <w:jc w:val="left"/>
-            </w:pPr>
-            <w:r>
-              <w:rPr>
-                <w:rFonts w:ascii="Calibri" w:hAnsi="Calibri"/>
-                <w:b/>
-                <w:i w:val="0"/>
-                <w:color w:val="FFFFFF"/>
-                <w:sz w:val="18"/>
-              </w:rPr>
-              <w:t>Información</w:t>
-            </w:r>
-          </w:p>
-        </w:tc>
-      </w:tr>
-      <w:tr>
-        <w:tc>
-          <w:tcPr>
-            <w:tcW w:type="dxa" w:w="2600"/>
-            <w:tcMar>
-              <w:top w:w="80" w:type="dxa"/>
-              <w:start w:w="120" w:type="dxa"/>
-              <w:bottom w:w="80" w:type="dxa"/>
-              <w:end w:w="120" w:type="dxa"/>
-            </w:tcMar>
-            <w:shd w:fill="FFFFFF"/>
-            <w:vAlign w:val="center"/>
-          </w:tcPr>
-          <w:p>
-            <w:pPr>
-              <w:spacing w:after="0" w:line="240" w:lineRule="auto"/>
-            </w:pPr>
-            <w:r>
-              <w:rPr>
-                <w:rFonts w:ascii="Calibri" w:hAnsi="Calibri"/>
-                <w:b w:val="0"/>
-                <w:i w:val="0"/>
-                <w:color w:val="334954"/>
-                <w:sz w:val="18"/>
-              </w:rPr>
-              <w:t>Estudiante</w:t>
-            </w:r>
-          </w:p>
-        </w:tc>
-        <w:tc>
-          <w:tcPr>
-            <w:tcW w:type="dxa" w:w="6760"/>
-            <w:tcMar>
-              <w:top w:w="80" w:type="dxa"/>
-              <w:start w:w="120" w:type="dxa"/>
-              <w:bottom w:w="80" w:type="dxa"/>
-              <w:end w:w="120" w:type="dxa"/>
-            </w:tcMar>
-            <w:shd w:fill="FFFFFF"/>
-            <w:vAlign w:val="center"/>
-          </w:tcPr>
-          <w:p>
-            <w:pPr>
-              <w:spacing w:after="0" w:line="240" w:lineRule="auto"/>
-            </w:pPr>
-            <w:r>
-              <w:rPr>
-                <w:rFonts w:ascii="Calibri" w:hAnsi="Calibri"/>
-                <w:b w:val="0"/>
-                <w:i w:val="0"/>
-                <w:color w:val="334954"/>
-                <w:sz w:val="18"/>
-              </w:rPr>
-              <w:t>Cristhian Alfredo Zambrano Zambrano</w:t>
-            </w:r>
-          </w:p>
-        </w:tc>
-      </w:tr>
-      <w:tr>
-        <w:tc>
-          <w:tcPr>
-            <w:tcW w:type="dxa" w:w="2600"/>
-            <w:tcMar>
-              <w:top w:w="80" w:type="dxa"/>
-              <w:start w:w="120" w:type="dxa"/>
-              <w:bottom w:w="80" w:type="dxa"/>
-              <w:end w:w="120" w:type="dxa"/>
-            </w:tcMar>
-            <w:shd w:fill="F3F5F7"/>
-            <w:vAlign w:val="center"/>
-          </w:tcPr>
-          <w:p>
-            <w:pPr>
-              <w:spacing w:after="0" w:line="240" w:lineRule="auto"/>
-            </w:pPr>
-            <w:r>
-              <w:rPr>
-                <w:rFonts w:ascii="Calibri" w:hAnsi="Calibri"/>
-                <w:b w:val="0"/>
-                <w:i w:val="0"/>
-                <w:color w:val="334954"/>
-                <w:sz w:val="18"/>
-              </w:rPr>
-              <w:t>Docente</w:t>
-            </w:r>
-          </w:p>
-        </w:tc>
-        <w:tc>
-          <w:tcPr>
-            <w:tcW w:type="dxa" w:w="6760"/>
-            <w:tcMar>
-              <w:top w:w="80" w:type="dxa"/>
-              <w:start w:w="120" w:type="dxa"/>
-              <w:bottom w:w="80" w:type="dxa"/>
-              <w:end w:w="120" w:type="dxa"/>
-            </w:tcMar>
-            <w:shd w:fill="F3F5F7"/>
-            <w:vAlign w:val="center"/>
-          </w:tcPr>
-          <w:p>
-            <w:pPr>
-              <w:spacing w:after="0" w:line="240" w:lineRule="auto"/>
-            </w:pPr>
-            <w:r>
-              <w:rPr>
-                <w:rFonts w:ascii="Calibri" w:hAnsi="Calibri"/>
-                <w:b w:val="0"/>
-                <w:i w:val="0"/>
-                <w:color w:val="334954"/>
-                <w:sz w:val="18"/>
-              </w:rPr>
-              <w:t>Mg. Enrique Javier Macías Arias</w:t>
-            </w:r>
-          </w:p>
-        </w:tc>
-      </w:tr>
-      <w:tr>
-        <w:tc>
-          <w:tcPr>
-            <w:tcW w:type="dxa" w:w="2600"/>
-            <w:tcMar>
-              <w:top w:w="80" w:type="dxa"/>
-              <w:start w:w="120" w:type="dxa"/>
-              <w:bottom w:w="80" w:type="dxa"/>
-              <w:end w:w="120" w:type="dxa"/>
-            </w:tcMar>
-            <w:shd w:fill="FFFFFF"/>
-            <w:vAlign w:val="center"/>
-          </w:tcPr>
-          <w:p>
-            <w:pPr>
-              <w:spacing w:after="0" w:line="240" w:lineRule="auto"/>
-            </w:pPr>
-            <w:r>
-              <w:rPr>
-                <w:rFonts w:ascii="Calibri" w:hAnsi="Calibri"/>
-                <w:b w:val="0"/>
-                <w:i w:val="0"/>
-                <w:color w:val="334954"/>
-                <w:sz w:val="18"/>
-              </w:rPr>
-              <w:t>Asignatura</w:t>
-            </w:r>
-          </w:p>
-        </w:tc>
-        <w:tc>
-          <w:tcPr>
-            <w:tcW w:type="dxa" w:w="6760"/>
-            <w:tcMar>
-              <w:top w:w="80" w:type="dxa"/>
-              <w:start w:w="120" w:type="dxa"/>
-              <w:bottom w:w="80" w:type="dxa"/>
-              <w:end w:w="120" w:type="dxa"/>
-            </w:tcMar>
-            <w:shd w:fill="FFFFFF"/>
-            <w:vAlign w:val="center"/>
-          </w:tcPr>
-          <w:p>
-            <w:pPr>
-              <w:spacing w:after="0" w:line="240" w:lineRule="auto"/>
-            </w:pPr>
-            <w:r>
-              <w:rPr>
-                <w:rFonts w:ascii="Calibri" w:hAnsi="Calibri"/>
-                <w:b w:val="0"/>
-                <w:i w:val="0"/>
-                <w:color w:val="334954"/>
-                <w:sz w:val="18"/>
-              </w:rPr>
-              <w:t>DevOps</w:t>
-            </w:r>
-          </w:p>
-        </w:tc>
-      </w:tr>
-      <w:tr>
-        <w:tc>
-          <w:tcPr>
-            <w:tcW w:type="dxa" w:w="2600"/>
-            <w:tcMar>
-              <w:top w:w="80" w:type="dxa"/>
-              <w:start w:w="120" w:type="dxa"/>
-              <w:bottom w:w="80" w:type="dxa"/>
-              <w:end w:w="120" w:type="dxa"/>
-            </w:tcMar>
-            <w:shd w:fill="F3F5F7"/>
-            <w:vAlign w:val="center"/>
-          </w:tcPr>
-          <w:p>
-            <w:pPr>
-              <w:spacing w:after="0" w:line="240" w:lineRule="auto"/>
-            </w:pPr>
-            <w:r>
-              <w:rPr>
-                <w:rFonts w:ascii="Calibri" w:hAnsi="Calibri"/>
-                <w:b w:val="0"/>
-                <w:i w:val="0"/>
-                <w:color w:val="334954"/>
-                <w:sz w:val="18"/>
-              </w:rPr>
-              <w:t>Cohorte</w:t>
-            </w:r>
-          </w:p>
-        </w:tc>
-        <w:tc>
-          <w:tcPr>
-            <w:tcW w:type="dxa" w:w="6760"/>
-            <w:tcMar>
-              <w:top w:w="80" w:type="dxa"/>
-              <w:start w:w="120" w:type="dxa"/>
-              <w:bottom w:w="80" w:type="dxa"/>
-              <w:end w:w="120" w:type="dxa"/>
-            </w:tcMar>
-            <w:shd w:fill="F3F5F7"/>
-            <w:vAlign w:val="center"/>
-          </w:tcPr>
-          <w:p>
-            <w:pPr>
-              <w:spacing w:after="0" w:line="240" w:lineRule="auto"/>
-            </w:pPr>
-            <w:r>
-              <w:rPr>
-                <w:rFonts w:ascii="Calibri" w:hAnsi="Calibri"/>
-                <w:b w:val="0"/>
-                <w:i w:val="0"/>
-                <w:color w:val="334954"/>
-                <w:sz w:val="18"/>
-              </w:rPr>
-              <w:t>II Cohorte - Paralelo A</w:t>
-            </w:r>
-          </w:p>
-        </w:tc>
-      </w:tr>
-    </w:tbl>
-    <w:p>
-      <w:pPr>
-        <w:spacing w:after="20"/>
-      </w:pPr>
-    </w:p>
-    <w:p>
-      <w:pPr>
-        <w:spacing w:before="960" w:after="0" w:line="259" w:lineRule="auto"/>
+        <w:spacing w:before="0" w:after="240" w:line="240" w:lineRule="auto"/>
         <w:jc w:val="center"/>
       </w:pPr>
       <w:r>
@@ -443,10 +99,172 @@
           <w:rFonts w:ascii="Calibri" w:hAnsi="Calibri"/>
           <w:b/>
           <w:i w:val="0"/>
-          <w:color w:val="667785"/>
+          <w:color w:val="263844"/>
           <w:sz w:val="20"/>
         </w:rPr>
-        <w:t>ESPAM MFL  |  2026</w:t>
+        <w:t>MAESTRÍA EN DISEÑO WEB Y DESARROLLO DE APPS</w:t>
+        <w:br/>
+        <w:t>II COHORTE PARALELO A</w:t>
+      </w:r>
+    </w:p>
+    <w:p>
+      <w:pPr>
+        <w:spacing w:before="0" w:after="60" w:line="240" w:lineRule="auto"/>
+        <w:jc w:val="center"/>
+      </w:pPr>
+      <w:r>
+        <w:rPr>
+          <w:rFonts w:ascii="Calibri" w:hAnsi="Calibri"/>
+          <w:b/>
+          <w:i w:val="0"/>
+          <w:color w:val="263844"/>
+          <w:sz w:val="20"/>
+        </w:rPr>
+        <w:t>TEMA:</w:t>
+      </w:r>
+    </w:p>
+    <w:p>
+      <w:pPr>
+        <w:spacing w:before="0" w:after="60" w:line="240" w:lineRule="auto"/>
+        <w:jc w:val="center"/>
+      </w:pPr>
+      <w:r>
+        <w:rPr>
+          <w:rFonts w:ascii="Calibri" w:hAnsi="Calibri"/>
+          <w:b/>
+          <w:i w:val="0"/>
+          <w:color w:val="12304A"/>
+          <w:sz w:val="36"/>
+        </w:rPr>
+        <w:t>PROYECTO INTEGRADOR DEVOPS - FASE 1</w:t>
+      </w:r>
+    </w:p>
+    <w:p>
+      <w:pPr>
+        <w:spacing w:before="0" w:after="200" w:line="240" w:lineRule="auto"/>
+        <w:jc w:val="center"/>
+      </w:pPr>
+      <w:r>
+        <w:rPr>
+          <w:rFonts w:ascii="Calibri" w:hAnsi="Calibri"/>
+          <w:b/>
+          <w:i w:val="0"/>
+          <w:color w:val="006B58"/>
+          <w:sz w:val="24"/>
+        </w:rPr>
+        <w:t>DIAGNÓSTICO Y PLANIFICACIÓN</w:t>
+      </w:r>
+    </w:p>
+    <w:p>
+      <w:pPr>
+        <w:spacing w:before="0" w:after="40" w:line="240" w:lineRule="auto"/>
+        <w:jc w:val="center"/>
+      </w:pPr>
+      <w:r>
+        <w:rPr>
+          <w:rFonts w:ascii="Calibri" w:hAnsi="Calibri"/>
+          <w:b/>
+          <w:i w:val="0"/>
+          <w:color w:val="263844"/>
+          <w:sz w:val="18"/>
+        </w:rPr>
+        <w:t>SISTEMA SELECCIONADO:</w:t>
+      </w:r>
+    </w:p>
+    <w:p>
+      <w:pPr>
+        <w:spacing w:before="0" w:after="180" w:line="240" w:lineRule="auto"/>
+        <w:jc w:val="center"/>
+      </w:pPr>
+      <w:r>
+        <w:rPr>
+          <w:rFonts w:ascii="Calibri" w:hAnsi="Calibri"/>
+          <w:b/>
+          <w:i w:val="0"/>
+          <w:color w:val="263844"/>
+          <w:sz w:val="19"/>
+        </w:rPr>
+        <w:t>SISTEMA WEB CRUD PARA LA GESTIÓN DE USUARIOS</w:t>
+      </w:r>
+    </w:p>
+    <w:p>
+      <w:pPr>
+        <w:spacing w:before="0" w:after="40" w:line="240" w:lineRule="auto"/>
+        <w:jc w:val="center"/>
+      </w:pPr>
+      <w:r>
+        <w:rPr>
+          <w:rFonts w:ascii="Calibri" w:hAnsi="Calibri"/>
+          <w:b/>
+          <w:i w:val="0"/>
+          <w:color w:val="263844"/>
+          <w:sz w:val="18"/>
+        </w:rPr>
+        <w:t>AUTOR:</w:t>
+      </w:r>
+    </w:p>
+    <w:p>
+      <w:pPr>
+        <w:spacing w:before="0" w:after="160" w:line="240" w:lineRule="auto"/>
+        <w:jc w:val="center"/>
+      </w:pPr>
+      <w:r>
+        <w:rPr>
+          <w:rFonts w:ascii="Calibri" w:hAnsi="Calibri"/>
+          <w:b/>
+          <w:i w:val="0"/>
+          <w:color w:val="263844"/>
+          <w:sz w:val="19"/>
+        </w:rPr>
+        <w:t>CRISTHIAN ALFREDO ZAMBRANO ZAMBRANO</w:t>
+      </w:r>
+    </w:p>
+    <w:p>
+      <w:pPr>
+        <w:spacing w:before="0" w:after="60" w:line="240" w:lineRule="auto"/>
+        <w:jc w:val="center"/>
+      </w:pPr>
+      <w:r>
+        <w:rPr>
+          <w:rFonts w:ascii="Calibri" w:hAnsi="Calibri"/>
+          <w:b/>
+          <w:i w:val="0"/>
+          <w:color w:val="263844"/>
+          <w:sz w:val="18"/>
+        </w:rPr>
+        <w:t>MÓDULO: DEVOPS</w:t>
+      </w:r>
+    </w:p>
+    <w:p>
+      <w:pPr>
+        <w:spacing w:before="0" w:after="180" w:line="240" w:lineRule="auto"/>
+        <w:jc w:val="center"/>
+      </w:pPr>
+      <w:r>
+        <w:rPr>
+          <w:rFonts w:ascii="Calibri" w:hAnsi="Calibri"/>
+          <w:b/>
+          <w:i w:val="0"/>
+          <w:color w:val="263844"/>
+          <w:sz w:val="18"/>
+        </w:rPr>
+        <w:t>DOCENTE: MG. ENRIQUE JAVIER MACÍAS ARIAS</w:t>
+      </w:r>
+    </w:p>
+    <w:p>
+      <w:pPr>
+        <w:spacing w:before="0" w:after="0" w:line="240" w:lineRule="auto"/>
+        <w:jc w:val="center"/>
+      </w:pPr>
+      <w:r>
+        <w:rPr>
+          <w:rFonts w:ascii="Calibri" w:hAnsi="Calibri"/>
+          <w:b/>
+          <w:i w:val="0"/>
+          <w:color w:val="263844"/>
+          <w:sz w:val="19"/>
+        </w:rPr>
+        <w:t>AGOSTO DE 2026</w:t>
       </w:r>
     </w:p>
     <w:p>
@@ -6465,6 +6283,7 @@
     <w:sectPr>
       <w:headerReference w:type="default" r:id="rId9"/>
       <w:footerReference w:type="default" r:id="rId10"/>
+      <w:footerReference w:type="first" r:id="rId11"/>
       <w:pgSz w:w="12240" w:h="15840"/>
       <w:pgMar w:top="1037" w:right="1123" w:bottom="979" w:left="1123" w:header="504" w:footer="504" w:gutter="0"/>
       <w:cols w:space="720"/>
@@ -6493,6 +6312,27 @@
       <w:t xml:space="preserve">Página </w:t>
     </w:r>
     <w:fldSimple w:instr="PAGE"/>
+  </w:p>
+</w:ftr>
+</file>
+
+<file path=word/footer2.xml><?xml version="1.0" encoding="utf-8"?>
+<w:ftr xmlns:m="http://schemas.openxmlformats.org/officeDocument/2006/math" xmlns:mc="http://schemas.openxmlformats.org/markup-compatibility/2006" xmlns:mo="http://schemas.microsoft.com/office/mac/office/2008/main" xmlns:mv="urn:schemas-microsoft-com:mac:vml" xmlns:o="urn:schemas-microsoft-com:office:office" xmlns:r="http://schemas.openxmlformats.org/officeDocument/2006/relationships" xmlns:v="urn:schemas-microsoft-com:vml" xmlns:w10="urn:schemas-microsoft-com:office:word" xmlns:w14="http://schemas.microsoft.com/office/word/2010/wordml" xmlns:w="http://schemas.openxmlformats.org/wordprocessingml/2006/main" xmlns:wne="http://schemas.microsoft.com/office/word/2006/wordml" xmlns:wp14="http://schemas.microsoft.com/office/word/2010/wordprocessingDrawing" xmlns:wp="http://schemas.openxmlformats.org/drawingml/2006/wordprocessingDrawing" xmlns:wpc="http://schemas.microsoft.com/office/word/2010/wordprocessingCanvas" xmlns:wpg="http://schemas.microsoft.com/office/word/2010/wordprocessingGroup" xmlns:wpi="http://schemas.microsoft.com/office/word/2010/wordprocessingInk" xmlns:wps="http://schemas.microsoft.com/office/word/2010/wordprocessingShape" mc:Ignorable="w14 wp14">
+  <w:p>
+    <w:pPr>
+      <w:pStyle w:val="Footer"/>
+      <w:jc w:val="center"/>
+    </w:pPr>
+    <w:r>
+      <w:rPr>
+        <w:rFonts w:ascii="Calibri" w:hAnsi="Calibri"/>
+        <w:b w:val="0"/>
+        <w:i w:val="0"/>
+        <w:color w:val="667785"/>
+        <w:sz w:val="15"/>
+      </w:rPr>
+      <w:t>ESPAM MFL | Maestría en Diseño Web y Desarrollo de Apps | Página 1</w:t>
+    </w:r>
   </w:p>
 </w:ftr>
 </file>

</xml_diff>